<commit_message>
The gate learns to notice a document that leaves, a page that appears, and a word that goes from bad to worse, and a corpus file named for two scripts is made to contain them
Co-Authored-By: Claude Opus 5 <noreply@anthropic.com>
</commit_message>
<xml_diff>
--- a/corpus/docx/rtl-and-cjk.docx
+++ b/corpus/docx/rtl-and-cjk.docx
@@ -1,24 +1,67 @@
 
 <file path=word/document.xml><?xml version="1.0" encoding="utf-8"?>
-<w:document xmlns:wpc="http://schemas.microsoft.com/office/word/2010/wordprocessingCanvas" xmlns:cx="http://schemas.microsoft.com/office/drawing/2014/chartex" xmlns:cx1="http://schemas.microsoft.com/office/drawing/2015/9/8/chartex" xmlns:cx2="http://schemas.microsoft.com/office/drawing/2015/10/21/chartex" xmlns:cx3="http://schemas.microsoft.com/office/drawing/2016/5/9/chartex" xmlns:cx4="http://schemas.microsoft.com/office/drawing/2016/5/10/chartex" xmlns:cx5="http://schemas.microsoft.com/office/drawing/2016/5/11/chartex" xmlns:cx6="http://schemas.microsoft.com/office/drawing/2016/5/12/chartex" xmlns:cx7="http://schemas.microsoft.com/office/drawing/2016/5/13/chartex" xmlns:cx8="http://schemas.microsoft.com/office/drawing/2016/5/14/chartex" xmlns:mc="http://schemas.openxmlformats.org/markup-compatibility/2006" xmlns:aink="http://schemas.microsoft.com/office/drawing/2016/ink" xmlns:am3d="http://schemas.microsoft.com/office/drawing/2017/model3d" xmlns:o="urn:schemas-microsoft-com:office:office" xmlns:oel="http://schemas.microsoft.com/office/2019/extlst" xmlns:r="http://schemas.openxmlformats.org/officeDocument/2006/relationships" xmlns:m="http://schemas.openxmlformats.org/officeDocument/2006/math" xmlns:v="urn:schemas-microsoft-com:vml" xmlns:wp14="http://schemas.microsoft.com/office/word/2010/wordprocessingDrawing" xmlns:wp="http://schemas.openxmlformats.org/drawingml/2006/wordprocessingDrawing" xmlns:w10="urn:schemas-microsoft-com:office:word" xmlns:w="http://schemas.openxmlformats.org/wordprocessingml/2006/main" xmlns:w14="http://schemas.microsoft.com/office/word/2010/wordml" xmlns:w15="http://schemas.microsoft.com/office/word/2012/wordml" xmlns:w16cei="http://schemas.microsoft.com/office/word/2026/wordml/cei" xmlns:w16cex="http://schemas.microsoft.com/office/word/2018/wordml/cex" xmlns:w16cid="http://schemas.microsoft.com/office/word/2016/wordml/cid" xmlns:w16="http://schemas.microsoft.com/office/word/2018/wordml" xmlns:w16du="http://schemas.microsoft.com/office/word/2023/wordml/word16du" xmlns:w16sdtdh="http://schemas.microsoft.com/office/word/2020/wordml/sdtdatahash" xmlns:w16sdtfl="http://schemas.microsoft.com/office/word/2024/wordml/sdtformatlock" xmlns:w16se="http://schemas.microsoft.com/office/word/2015/wordml/symex" xmlns:wpg="http://schemas.microsoft.com/office/word/2010/wordprocessingGroup" xmlns:wpi="http://schemas.microsoft.com/office/word/2010/wordprocessingInk" xmlns:wne="http://schemas.microsoft.com/office/word/2006/wordml" xmlns:wps="http://schemas.microsoft.com/office/word/2010/wordprocessingShape" mc:Ignorable="w14 w15 w16se w16cid w16 w16cex w16sdtdh w16sdtfl w16du wp14">
+<w:document xmlns:wpc="http://schemas.microsoft.com/office/word/2010/wordprocessingCanvas" xmlns:cx="http://schemas.microsoft.com/office/drawing/2014/chartex" xmlns:cx1="http://schemas.microsoft.com/office/drawing/2015/9/8/chartex" xmlns:cx2="http://schemas.microsoft.com/office/drawing/2015/10/21/chartex" xmlns:cx3="http://schemas.microsoft.com/office/drawing/2016/5/9/chartex" xmlns:cx4="http://schemas.microsoft.com/office/drawing/2016/5/10/chartex" xmlns:cx5="http://schemas.microsoft.com/office/drawing/2016/5/11/chartex" xmlns:cx6="http://schemas.microsoft.com/office/drawing/2016/5/12/chartex" xmlns:cx7="http://schemas.microsoft.com/office/drawing/2016/5/13/chartex" xmlns:cx8="http://schemas.microsoft.com/office/drawing/2016/5/14/chartex" xmlns:mc="http://schemas.openxmlformats.org/markup-compatibility/2006" xmlns:aink="http://schemas.microsoft.com/office/drawing/2016/ink" xmlns:am3d="http://schemas.microsoft.com/office/drawing/2017/model3d" xmlns:o="urn:schemas-microsoft-com:office:office" xmlns:oel="http://schemas.microsoft.com/office/2019/extlst" xmlns:r="http://schemas.openxmlformats.org/officeDocument/2006/relationships" xmlns:m="http://schemas.openxmlformats.org/officeDocument/2006/math" xmlns:v="urn:schemas-microsoft-com:vml" xmlns:wp14="http://schemas.microsoft.com/office/word/2010/wordprocessingDrawing" xmlns:wp="http://schemas.openxmlformats.org/drawingml/2006/wordprocessingDrawing" xmlns:w10="urn:schemas-microsoft-com:office:word" xmlns:w="http://schemas.openxmlformats.org/wordprocessingml/2006/main" xmlns:w14="http://schemas.microsoft.com/office/word/2010/wordml" xmlns:w15="http://schemas.microsoft.com/office/word/2012/wordml" xmlns:w16cex="http://schemas.microsoft.com/office/word/2018/wordml/cex" xmlns:w16cid="http://schemas.microsoft.com/office/word/2016/wordml/cid" xmlns:w16="http://schemas.microsoft.com/office/word/2018/wordml" xmlns:w16du="http://schemas.microsoft.com/office/word/2023/wordml/word16du" xmlns:w16sdtdh="http://schemas.microsoft.com/office/word/2020/wordml/sdtdatahash" xmlns:w16sdtfl="http://schemas.microsoft.com/office/word/2024/wordml/sdtformatlock" xmlns:w16se="http://schemas.microsoft.com/office/word/2015/wordml/symex" xmlns:wpg="http://schemas.microsoft.com/office/word/2010/wordprocessingGroup" xmlns:wpi="http://schemas.microsoft.com/office/word/2010/wordprocessingInk" xmlns:wne="http://schemas.microsoft.com/office/word/2006/wordml" xmlns:wps="http://schemas.microsoft.com/office/word/2010/wordprocessingShape" mc:Ignorable="w14 w15 w16se w16cid w16 w16cex w16sdtdh w16sdtfl w16du wp14">
   <w:body>
     <w:p>
       <w:r>
+        <w:t>English baseline text.</w:t>
+      </w:r>
+    </w:p>
+    <w:p>
+      <w:r>
         <w:rPr>
-          <w:rFonts w:ascii="MS Gothic" w:eastAsia="MS Gothic" w:hAnsi="MS Gothic" w:cs="MS Gothic"/>
+          <w:rFonts w:ascii="Arial" w:hAnsi="Arial" w:cs="Arial"/>
         </w:rPr>
+        <w:t>مرحبا</w:t>
+      </w:r>
+      <w:r>
+        <w:t xml:space="preserve"> (Arabic)</w:t>
+      </w:r>
+    </w:p>
+    <w:p>
+      <w:r>
+        <w:rPr>
+          <w:rFonts w:ascii="Arial" w:hAnsi="Arial" w:cs="Arial"/>
+        </w:rPr>
+        <w:t>שלום</w:t>
+      </w:r>
+      <w:r>
+        <w:t xml:space="preserve"> (Hebrew)</w:t>
+      </w:r>
+    </w:p>
+    <w:p>
+      <w:r>
+        <w:rPr>
+          <w:rFonts w:ascii="MS Gothic" w:eastAsia="MS Gothic" w:hAnsi="MS Gothic" w:cs="MS Gothic" w:hint="eastAsia"/>
+        </w:rPr>
+        <w:t>你好世界</w:t>
+      </w:r>
+      <w:r>
+        <w:t xml:space="preserve"> (Chinese)</w:t>
+      </w:r>
+    </w:p>
+    <w:p>
+      <w:r>
+        <w:rPr>
+          <w:rFonts w:ascii="MS Gothic" w:eastAsia="MS Gothic" w:hAnsi="MS Gothic" w:cs="MS Gothic" w:hint="eastAsia"/>
+        </w:rPr>
+        <w:t>こんにちは</w:t>
+      </w:r>
+      <w:r>
+        <w:t xml:space="preserve"> (Japanese)</w:t>
+      </w:r>
+    </w:p>
+    <w:p>
+      <w:r>
         <w:t xml:space="preserve">Mixed </w:t>
       </w:r>
       <w:r>
         <w:rPr>
-          <w:rFonts w:ascii="Courier New" w:eastAsia="MS Gothic" w:hAnsi="Courier New" w:cs="Courier New"/>
+          <w:rFonts w:ascii="Arial" w:hAnsi="Arial" w:cs="Arial"/>
         </w:rPr>
         <w:t>مرحبا</w:t>
       </w:r>
       <w:r>
-        <w:rPr>
-          <w:rFonts w:ascii="MS Gothic" w:eastAsia="MS Gothic" w:hAnsi="MS Gothic" w:cs="MS Gothic"/>
-        </w:rPr>
         <w:t xml:space="preserve"> inline.</w:t>
       </w:r>
     </w:p>
@@ -440,7 +483,7 @@
     <w:link w:val="Heading1Char"/>
     <w:uiPriority w:val="9"/>
     <w:qFormat/>
-    <w:rsid w:val="00D07D9B"/>
+    <w:rsid w:val="00187FFE"/>
     <w:pPr>
       <w:keepNext/>
       <w:keepLines/>
@@ -449,7 +492,7 @@
     </w:pPr>
     <w:rPr>
       <w:rFonts w:asciiTheme="majorHAnsi" w:eastAsiaTheme="majorEastAsia" w:hAnsiTheme="majorHAnsi" w:cstheme="majorBidi"/>
-      <w:color w:val="2F5496" w:themeColor="accent1" w:themeShade="BF"/>
+      <w:color w:val="0F4761" w:themeColor="accent1" w:themeShade="BF"/>
       <w:sz w:val="40"/>
       <w:szCs w:val="40"/>
     </w:rPr>
@@ -463,7 +506,7 @@
     <w:semiHidden/>
     <w:unhideWhenUsed/>
     <w:qFormat/>
-    <w:rsid w:val="00D07D9B"/>
+    <w:rsid w:val="00187FFE"/>
     <w:pPr>
       <w:keepNext/>
       <w:keepLines/>
@@ -472,7 +515,7 @@
     </w:pPr>
     <w:rPr>
       <w:rFonts w:asciiTheme="majorHAnsi" w:eastAsiaTheme="majorEastAsia" w:hAnsiTheme="majorHAnsi" w:cstheme="majorBidi"/>
-      <w:color w:val="2F5496" w:themeColor="accent1" w:themeShade="BF"/>
+      <w:color w:val="0F4761" w:themeColor="accent1" w:themeShade="BF"/>
       <w:sz w:val="32"/>
       <w:szCs w:val="32"/>
     </w:rPr>
@@ -486,7 +529,7 @@
     <w:semiHidden/>
     <w:unhideWhenUsed/>
     <w:qFormat/>
-    <w:rsid w:val="00D07D9B"/>
+    <w:rsid w:val="00187FFE"/>
     <w:pPr>
       <w:keepNext/>
       <w:keepLines/>
@@ -495,7 +538,7 @@
     </w:pPr>
     <w:rPr>
       <w:rFonts w:eastAsiaTheme="majorEastAsia" w:cstheme="majorBidi"/>
-      <w:color w:val="2F5496" w:themeColor="accent1" w:themeShade="BF"/>
+      <w:color w:val="0F4761" w:themeColor="accent1" w:themeShade="BF"/>
       <w:sz w:val="28"/>
       <w:szCs w:val="28"/>
     </w:rPr>
@@ -509,7 +552,7 @@
     <w:semiHidden/>
     <w:unhideWhenUsed/>
     <w:qFormat/>
-    <w:rsid w:val="00D07D9B"/>
+    <w:rsid w:val="00187FFE"/>
     <w:pPr>
       <w:keepNext/>
       <w:keepLines/>
@@ -520,7 +563,7 @@
       <w:rFonts w:eastAsiaTheme="majorEastAsia" w:cstheme="majorBidi"/>
       <w:i/>
       <w:iCs/>
-      <w:color w:val="2F5496" w:themeColor="accent1" w:themeShade="BF"/>
+      <w:color w:val="0F4761" w:themeColor="accent1" w:themeShade="BF"/>
     </w:rPr>
   </w:style>
   <w:style w:type="paragraph" w:styleId="Heading5">
@@ -532,7 +575,7 @@
     <w:semiHidden/>
     <w:unhideWhenUsed/>
     <w:qFormat/>
-    <w:rsid w:val="00D07D9B"/>
+    <w:rsid w:val="00187FFE"/>
     <w:pPr>
       <w:keepNext/>
       <w:keepLines/>
@@ -541,7 +584,7 @@
     </w:pPr>
     <w:rPr>
       <w:rFonts w:eastAsiaTheme="majorEastAsia" w:cstheme="majorBidi"/>
-      <w:color w:val="2F5496" w:themeColor="accent1" w:themeShade="BF"/>
+      <w:color w:val="0F4761" w:themeColor="accent1" w:themeShade="BF"/>
     </w:rPr>
   </w:style>
   <w:style w:type="paragraph" w:styleId="Heading6">
@@ -553,7 +596,7 @@
     <w:semiHidden/>
     <w:unhideWhenUsed/>
     <w:qFormat/>
-    <w:rsid w:val="00D07D9B"/>
+    <w:rsid w:val="00187FFE"/>
     <w:pPr>
       <w:keepNext/>
       <w:keepLines/>
@@ -576,7 +619,7 @@
     <w:semiHidden/>
     <w:unhideWhenUsed/>
     <w:qFormat/>
-    <w:rsid w:val="00D07D9B"/>
+    <w:rsid w:val="00187FFE"/>
     <w:pPr>
       <w:keepNext/>
       <w:keepLines/>
@@ -597,7 +640,7 @@
     <w:semiHidden/>
     <w:unhideWhenUsed/>
     <w:qFormat/>
-    <w:rsid w:val="00D07D9B"/>
+    <w:rsid w:val="00187FFE"/>
     <w:pPr>
       <w:keepNext/>
       <w:keepLines/>
@@ -620,7 +663,7 @@
     <w:semiHidden/>
     <w:unhideWhenUsed/>
     <w:qFormat/>
-    <w:rsid w:val="00D07D9B"/>
+    <w:rsid w:val="00187FFE"/>
     <w:pPr>
       <w:keepNext/>
       <w:keepLines/>
@@ -664,10 +707,10 @@
     <w:basedOn w:val="DefaultParagraphFont"/>
     <w:link w:val="Heading1"/>
     <w:uiPriority w:val="9"/>
-    <w:rsid w:val="00D07D9B"/>
+    <w:rsid w:val="00187FFE"/>
     <w:rPr>
       <w:rFonts w:asciiTheme="majorHAnsi" w:eastAsiaTheme="majorEastAsia" w:hAnsiTheme="majorHAnsi" w:cstheme="majorBidi"/>
-      <w:color w:val="2F5496" w:themeColor="accent1" w:themeShade="BF"/>
+      <w:color w:val="0F4761" w:themeColor="accent1" w:themeShade="BF"/>
       <w:sz w:val="40"/>
       <w:szCs w:val="40"/>
     </w:rPr>
@@ -678,10 +721,10 @@
     <w:link w:val="Heading2"/>
     <w:uiPriority w:val="9"/>
     <w:semiHidden/>
-    <w:rsid w:val="00D07D9B"/>
+    <w:rsid w:val="00187FFE"/>
     <w:rPr>
       <w:rFonts w:asciiTheme="majorHAnsi" w:eastAsiaTheme="majorEastAsia" w:hAnsiTheme="majorHAnsi" w:cstheme="majorBidi"/>
-      <w:color w:val="2F5496" w:themeColor="accent1" w:themeShade="BF"/>
+      <w:color w:val="0F4761" w:themeColor="accent1" w:themeShade="BF"/>
       <w:sz w:val="32"/>
       <w:szCs w:val="32"/>
     </w:rPr>
@@ -692,10 +735,10 @@
     <w:link w:val="Heading3"/>
     <w:uiPriority w:val="9"/>
     <w:semiHidden/>
-    <w:rsid w:val="00D07D9B"/>
-    <w:rPr>
-      <w:rFonts w:eastAsiaTheme="majorEastAsia" w:cstheme="majorBidi"/>
-      <w:color w:val="2F5496" w:themeColor="accent1" w:themeShade="BF"/>
+    <w:rsid w:val="00187FFE"/>
+    <w:rPr>
+      <w:rFonts w:eastAsiaTheme="majorEastAsia" w:cstheme="majorBidi"/>
+      <w:color w:val="0F4761" w:themeColor="accent1" w:themeShade="BF"/>
       <w:sz w:val="28"/>
       <w:szCs w:val="28"/>
     </w:rPr>
@@ -706,12 +749,12 @@
     <w:link w:val="Heading4"/>
     <w:uiPriority w:val="9"/>
     <w:semiHidden/>
-    <w:rsid w:val="00D07D9B"/>
+    <w:rsid w:val="00187FFE"/>
     <w:rPr>
       <w:rFonts w:eastAsiaTheme="majorEastAsia" w:cstheme="majorBidi"/>
       <w:i/>
       <w:iCs/>
-      <w:color w:val="2F5496" w:themeColor="accent1" w:themeShade="BF"/>
+      <w:color w:val="0F4761" w:themeColor="accent1" w:themeShade="BF"/>
     </w:rPr>
   </w:style>
   <w:style w:type="character" w:customStyle="1" w:styleId="Heading5Char">
@@ -720,10 +763,10 @@
     <w:link w:val="Heading5"/>
     <w:uiPriority w:val="9"/>
     <w:semiHidden/>
-    <w:rsid w:val="00D07D9B"/>
-    <w:rPr>
-      <w:rFonts w:eastAsiaTheme="majorEastAsia" w:cstheme="majorBidi"/>
-      <w:color w:val="2F5496" w:themeColor="accent1" w:themeShade="BF"/>
+    <w:rsid w:val="00187FFE"/>
+    <w:rPr>
+      <w:rFonts w:eastAsiaTheme="majorEastAsia" w:cstheme="majorBidi"/>
+      <w:color w:val="0F4761" w:themeColor="accent1" w:themeShade="BF"/>
     </w:rPr>
   </w:style>
   <w:style w:type="character" w:customStyle="1" w:styleId="Heading6Char">
@@ -732,7 +775,7 @@
     <w:link w:val="Heading6"/>
     <w:uiPriority w:val="9"/>
     <w:semiHidden/>
-    <w:rsid w:val="00D07D9B"/>
+    <w:rsid w:val="00187FFE"/>
     <w:rPr>
       <w:rFonts w:eastAsiaTheme="majorEastAsia" w:cstheme="majorBidi"/>
       <w:i/>
@@ -746,7 +789,7 @@
     <w:link w:val="Heading7"/>
     <w:uiPriority w:val="9"/>
     <w:semiHidden/>
-    <w:rsid w:val="00D07D9B"/>
+    <w:rsid w:val="00187FFE"/>
     <w:rPr>
       <w:rFonts w:eastAsiaTheme="majorEastAsia" w:cstheme="majorBidi"/>
       <w:color w:val="595959" w:themeColor="text1" w:themeTint="A6"/>
@@ -758,7 +801,7 @@
     <w:link w:val="Heading8"/>
     <w:uiPriority w:val="9"/>
     <w:semiHidden/>
-    <w:rsid w:val="00D07D9B"/>
+    <w:rsid w:val="00187FFE"/>
     <w:rPr>
       <w:rFonts w:eastAsiaTheme="majorEastAsia" w:cstheme="majorBidi"/>
       <w:i/>
@@ -772,7 +815,7 @@
     <w:link w:val="Heading9"/>
     <w:uiPriority w:val="9"/>
     <w:semiHidden/>
-    <w:rsid w:val="00D07D9B"/>
+    <w:rsid w:val="00187FFE"/>
     <w:rPr>
       <w:rFonts w:eastAsiaTheme="majorEastAsia" w:cstheme="majorBidi"/>
       <w:color w:val="272727" w:themeColor="text1" w:themeTint="D8"/>
@@ -785,7 +828,7 @@
     <w:link w:val="TitleChar"/>
     <w:uiPriority w:val="10"/>
     <w:qFormat/>
-    <w:rsid w:val="00D07D9B"/>
+    <w:rsid w:val="00187FFE"/>
     <w:pPr>
       <w:spacing w:after="80" w:line="240" w:lineRule="auto"/>
       <w:contextualSpacing/>
@@ -803,7 +846,7 @@
     <w:basedOn w:val="DefaultParagraphFont"/>
     <w:link w:val="Title"/>
     <w:uiPriority w:val="10"/>
-    <w:rsid w:val="00D07D9B"/>
+    <w:rsid w:val="00187FFE"/>
     <w:rPr>
       <w:rFonts w:asciiTheme="majorHAnsi" w:eastAsiaTheme="majorEastAsia" w:hAnsiTheme="majorHAnsi" w:cstheme="majorBidi"/>
       <w:spacing w:val="-10"/>
@@ -819,7 +862,7 @@
     <w:link w:val="SubtitleChar"/>
     <w:uiPriority w:val="11"/>
     <w:qFormat/>
-    <w:rsid w:val="00D07D9B"/>
+    <w:rsid w:val="00187FFE"/>
     <w:pPr>
       <w:numPr>
         <w:ilvl w:val="1"/>
@@ -838,7 +881,7 @@
     <w:basedOn w:val="DefaultParagraphFont"/>
     <w:link w:val="Subtitle"/>
     <w:uiPriority w:val="11"/>
-    <w:rsid w:val="00D07D9B"/>
+    <w:rsid w:val="00187FFE"/>
     <w:rPr>
       <w:rFonts w:eastAsiaTheme="majorEastAsia" w:cstheme="majorBidi"/>
       <w:color w:val="595959" w:themeColor="text1" w:themeTint="A6"/>
@@ -854,7 +897,7 @@
     <w:link w:val="QuoteChar"/>
     <w:uiPriority w:val="29"/>
     <w:qFormat/>
-    <w:rsid w:val="00D07D9B"/>
+    <w:rsid w:val="00187FFE"/>
     <w:pPr>
       <w:spacing w:before="160"/>
       <w:jc w:val="center"/>
@@ -870,7 +913,7 @@
     <w:basedOn w:val="DefaultParagraphFont"/>
     <w:link w:val="Quote"/>
     <w:uiPriority w:val="29"/>
-    <w:rsid w:val="00D07D9B"/>
+    <w:rsid w:val="00187FFE"/>
     <w:rPr>
       <w:i/>
       <w:iCs/>
@@ -882,7 +925,7 @@
     <w:basedOn w:val="Normal"/>
     <w:uiPriority w:val="34"/>
     <w:qFormat/>
-    <w:rsid w:val="00D07D9B"/>
+    <w:rsid w:val="00187FFE"/>
     <w:pPr>
       <w:ind w:left="720"/>
       <w:contextualSpacing/>
@@ -893,11 +936,11 @@
     <w:basedOn w:val="DefaultParagraphFont"/>
     <w:uiPriority w:val="21"/>
     <w:qFormat/>
-    <w:rsid w:val="00D07D9B"/>
+    <w:rsid w:val="00187FFE"/>
     <w:rPr>
       <w:i/>
       <w:iCs/>
-      <w:color w:val="2F5496" w:themeColor="accent1" w:themeShade="BF"/>
+      <w:color w:val="0F4761" w:themeColor="accent1" w:themeShade="BF"/>
     </w:rPr>
   </w:style>
   <w:style w:type="paragraph" w:styleId="IntenseQuote">
@@ -907,11 +950,11 @@
     <w:link w:val="IntenseQuoteChar"/>
     <w:uiPriority w:val="30"/>
     <w:qFormat/>
-    <w:rsid w:val="00D07D9B"/>
+    <w:rsid w:val="00187FFE"/>
     <w:pPr>
       <w:pBdr>
-        <w:top w:val="single" w:sz="4" w:space="10" w:color="2F5496" w:themeColor="accent1" w:themeShade="BF"/>
-        <w:bottom w:val="single" w:sz="4" w:space="10" w:color="2F5496" w:themeColor="accent1" w:themeShade="BF"/>
+        <w:top w:val="single" w:sz="4" w:space="10" w:color="0F4761" w:themeColor="accent1" w:themeShade="BF"/>
+        <w:bottom w:val="single" w:sz="4" w:space="10" w:color="0F4761" w:themeColor="accent1" w:themeShade="BF"/>
       </w:pBdr>
       <w:spacing w:before="360" w:after="360"/>
       <w:ind w:left="864" w:right="864"/>
@@ -920,7 +963,7 @@
     <w:rPr>
       <w:i/>
       <w:iCs/>
-      <w:color w:val="2F5496" w:themeColor="accent1" w:themeShade="BF"/>
+      <w:color w:val="0F4761" w:themeColor="accent1" w:themeShade="BF"/>
     </w:rPr>
   </w:style>
   <w:style w:type="character" w:customStyle="1" w:styleId="IntenseQuoteChar">
@@ -928,11 +971,11 @@
     <w:basedOn w:val="DefaultParagraphFont"/>
     <w:link w:val="IntenseQuote"/>
     <w:uiPriority w:val="30"/>
-    <w:rsid w:val="00D07D9B"/>
+    <w:rsid w:val="00187FFE"/>
     <w:rPr>
       <w:i/>
       <w:iCs/>
-      <w:color w:val="2F5496" w:themeColor="accent1" w:themeShade="BF"/>
+      <w:color w:val="0F4761" w:themeColor="accent1" w:themeShade="BF"/>
     </w:rPr>
   </w:style>
   <w:style w:type="character" w:styleId="IntenseReference">
@@ -940,12 +983,12 @@
     <w:basedOn w:val="DefaultParagraphFont"/>
     <w:uiPriority w:val="32"/>
     <w:qFormat/>
-    <w:rsid w:val="00D07D9B"/>
+    <w:rsid w:val="00187FFE"/>
     <w:rPr>
       <w:b/>
       <w:bCs/>
       <w:smallCaps/>
-      <w:color w:val="2F5496" w:themeColor="accent1" w:themeShade="BF"/>
+      <w:color w:val="0F4761" w:themeColor="accent1" w:themeShade="BF"/>
       <w:spacing w:val="5"/>
     </w:rPr>
   </w:style>
@@ -963,39 +1006,39 @@
         <a:sysClr val="window" lastClr="FFFFFF"/>
       </a:lt1>
       <a:dk2>
-        <a:srgbClr val="44546A"/>
+        <a:srgbClr val="0E2841"/>
       </a:dk2>
       <a:lt2>
-        <a:srgbClr val="E7E6E6"/>
+        <a:srgbClr val="E8E8E8"/>
       </a:lt2>
       <a:accent1>
-        <a:srgbClr val="4472C4"/>
+        <a:srgbClr val="156082"/>
       </a:accent1>
       <a:accent2>
-        <a:srgbClr val="ED7D31"/>
+        <a:srgbClr val="E97132"/>
       </a:accent2>
       <a:accent3>
-        <a:srgbClr val="A5A5A5"/>
+        <a:srgbClr val="196B24"/>
       </a:accent3>
       <a:accent4>
-        <a:srgbClr val="FFC000"/>
+        <a:srgbClr val="0F9ED5"/>
       </a:accent4>
       <a:accent5>
-        <a:srgbClr val="5B9BD5"/>
+        <a:srgbClr val="A02B93"/>
       </a:accent5>
       <a:accent6>
-        <a:srgbClr val="70AD47"/>
+        <a:srgbClr val="4EA72E"/>
       </a:accent6>
       <a:hlink>
-        <a:srgbClr val="0563C1"/>
+        <a:srgbClr val="467886"/>
       </a:hlink>
       <a:folHlink>
-        <a:srgbClr val="954F72"/>
+        <a:srgbClr val="96607D"/>
       </a:folHlink>
     </a:clrScheme>
     <a:fontScheme name="Office">
       <a:majorFont>
-        <a:latin typeface="Calibri Light" panose="020F0302020204030204"/>
+        <a:latin typeface="Aptos Display" panose="02110004020202020204"/>
         <a:ea typeface=""/>
         <a:cs typeface=""/>
         <a:font script="Jpan" typeface="游ゴシック Light"/>
@@ -1047,7 +1090,7 @@
         <a:font script="Tfng" typeface="Ebrima"/>
       </a:majorFont>
       <a:minorFont>
-        <a:latin typeface="Calibri" panose="020F0502020204030204"/>
+        <a:latin typeface="Aptos" panose="02110004020202020204"/>
         <a:ea typeface=""/>
         <a:cs typeface=""/>
         <a:font script="Jpan" typeface="游明朝"/>
@@ -1158,13 +1201,6 @@
         </a:gradFill>
       </a:fillStyleLst>
       <a:lnStyleLst>
-        <a:ln w="6350" cap="flat" cmpd="sng" algn="ctr">
-          <a:solidFill>
-            <a:schemeClr val="phClr"/>
-          </a:solidFill>
-          <a:prstDash val="solid"/>
-          <a:miter lim="800000"/>
-        </a:ln>
         <a:ln w="12700" cap="flat" cmpd="sng" algn="ctr">
           <a:solidFill>
             <a:schemeClr val="phClr"/>
@@ -1173,6 +1209,13 @@
           <a:miter lim="800000"/>
         </a:ln>
         <a:ln w="19050" cap="flat" cmpd="sng" algn="ctr">
+          <a:solidFill>
+            <a:schemeClr val="phClr"/>
+          </a:solidFill>
+          <a:prstDash val="solid"/>
+          <a:miter lim="800000"/>
+        </a:ln>
+        <a:ln w="25400" cap="flat" cmpd="sng" algn="ctr">
           <a:solidFill>
             <a:schemeClr val="phClr"/>
           </a:solidFill>
@@ -1237,11 +1280,31 @@
       </a:bgFillStyleLst>
     </a:fmtScheme>
   </a:themeElements>
-  <a:objectDefaults/>
+  <a:objectDefaults>
+    <a:lnDef>
+      <a:spPr/>
+      <a:bodyPr/>
+      <a:lstStyle/>
+      <a:style>
+        <a:lnRef idx="2">
+          <a:schemeClr val="accent1"/>
+        </a:lnRef>
+        <a:fillRef idx="0">
+          <a:schemeClr val="accent1"/>
+        </a:fillRef>
+        <a:effectRef idx="1">
+          <a:schemeClr val="accent1"/>
+        </a:effectRef>
+        <a:fontRef idx="minor">
+          <a:schemeClr val="tx1"/>
+        </a:fontRef>
+      </a:style>
+    </a:lnDef>
+  </a:objectDefaults>
   <a:extraClrSchemeLst/>
   <a:extLst>
     <a:ext uri="{05A4C25C-085E-4340-85A3-A5531E510DB2}">
-      <thm15:themeFamily xmlns:thm15="http://schemas.microsoft.com/office/thememl/2012/main" name="Office Theme" id="{62F939B6-93AF-4DB8-9C6B-D6C7DFDC589F}" vid="{4A3C46E8-61CC-4603-A589-7422A47A8E4A}"/>
+      <thm15:themeFamily xmlns:thm15="http://schemas.microsoft.com/office/thememl/2012/main" name="Office Theme" id="{2E142A2C-CD16-42D6-873A-C26D2A0506FA}" vid="{1BDDFF52-6CD6-40A5-AB3C-68EB2F1E4D0A}"/>
     </a:ext>
   </a:extLst>
 </a:theme>

</xml_diff>